<commit_message>
trabajo echo: revision de  microservicios y corregir audit_logs
</commit_message>
<xml_diff>
--- a/Documentacion/Arquitectura-P3.docx
+++ b/Documentacion/Arquitectura-P3.docx
@@ -499,23 +499,7 @@
               <w:caps/>
             </w:rPr>
             <w:fldChar w:fldCharType="begin"/>
-          </w:r>
-          <w:r>
-            <w:rPr>
-              <w:rFonts w:cs="Times New Roman"/>
-              <w:i w:val="0"/>
-              <w:iCs w:val="0"/>
-              <w:caps/>
-            </w:rPr>
             <w:instrText xml:space="preserve"> TOC \o "1-3" \h \z \u </w:instrText>
-          </w:r>
-          <w:r>
-            <w:rPr>
-              <w:rFonts w:cs="Times New Roman"/>
-              <w:i w:val="0"/>
-              <w:iCs w:val="0"/>
-              <w:caps/>
-            </w:rPr>
             <w:fldChar w:fldCharType="separate"/>
           </w:r>
           <w:hyperlink w:anchor="_Toc225889248" w:history="1">
@@ -534,46 +518,10 @@
                 <w:webHidden/>
               </w:rPr>
               <w:tab/>
-            </w:r>
-            <w:r>
-              <w:rPr>
-                <w:noProof/>
-                <w:webHidden/>
-              </w:rPr>
               <w:fldChar w:fldCharType="begin"/>
-            </w:r>
-            <w:r>
-              <w:rPr>
-                <w:noProof/>
-                <w:webHidden/>
-              </w:rPr>
               <w:instrText xml:space="preserve"> PAGEREF _Toc225889248 \h </w:instrText>
-            </w:r>
-            <w:r>
-              <w:rPr>
-                <w:noProof/>
-                <w:webHidden/>
-              </w:rPr>
-            </w:r>
-            <w:r>
-              <w:rPr>
-                <w:noProof/>
-                <w:webHidden/>
-              </w:rPr>
               <w:fldChar w:fldCharType="separate"/>
-            </w:r>
-            <w:r>
-              <w:rPr>
-                <w:noProof/>
-                <w:webHidden/>
-              </w:rPr>
               <w:t>4</w:t>
-            </w:r>
-            <w:r>
-              <w:rPr>
-                <w:noProof/>
-                <w:webHidden/>
-              </w:rPr>
               <w:fldChar w:fldCharType="end"/>
             </w:r>
           </w:hyperlink>
@@ -610,46 +558,10 @@
                 <w:webHidden/>
               </w:rPr>
               <w:tab/>
-            </w:r>
-            <w:r>
-              <w:rPr>
-                <w:noProof/>
-                <w:webHidden/>
-              </w:rPr>
               <w:fldChar w:fldCharType="begin"/>
-            </w:r>
-            <w:r>
-              <w:rPr>
-                <w:noProof/>
-                <w:webHidden/>
-              </w:rPr>
               <w:instrText xml:space="preserve"> PAGEREF _Toc225889249 \h </w:instrText>
-            </w:r>
-            <w:r>
-              <w:rPr>
-                <w:noProof/>
-                <w:webHidden/>
-              </w:rPr>
-            </w:r>
-            <w:r>
-              <w:rPr>
-                <w:noProof/>
-                <w:webHidden/>
-              </w:rPr>
               <w:fldChar w:fldCharType="separate"/>
-            </w:r>
-            <w:r>
-              <w:rPr>
-                <w:noProof/>
-                <w:webHidden/>
-              </w:rPr>
               <w:t>4</w:t>
-            </w:r>
-            <w:r>
-              <w:rPr>
-                <w:noProof/>
-                <w:webHidden/>
-              </w:rPr>
               <w:fldChar w:fldCharType="end"/>
             </w:r>
           </w:hyperlink>
@@ -685,46 +597,10 @@
                 <w:webHidden/>
               </w:rPr>
               <w:tab/>
-            </w:r>
-            <w:r>
-              <w:rPr>
-                <w:noProof/>
-                <w:webHidden/>
-              </w:rPr>
               <w:fldChar w:fldCharType="begin"/>
-            </w:r>
-            <w:r>
-              <w:rPr>
-                <w:noProof/>
-                <w:webHidden/>
-              </w:rPr>
               <w:instrText xml:space="preserve"> PAGEREF _Toc225889250 \h </w:instrText>
-            </w:r>
-            <w:r>
-              <w:rPr>
-                <w:noProof/>
-                <w:webHidden/>
-              </w:rPr>
-            </w:r>
-            <w:r>
-              <w:rPr>
-                <w:noProof/>
-                <w:webHidden/>
-              </w:rPr>
               <w:fldChar w:fldCharType="separate"/>
-            </w:r>
-            <w:r>
-              <w:rPr>
-                <w:noProof/>
-                <w:webHidden/>
-              </w:rPr>
               <w:t>4</w:t>
-            </w:r>
-            <w:r>
-              <w:rPr>
-                <w:noProof/>
-                <w:webHidden/>
-              </w:rPr>
               <w:fldChar w:fldCharType="end"/>
             </w:r>
           </w:hyperlink>
@@ -760,46 +636,10 @@
                 <w:webHidden/>
               </w:rPr>
               <w:tab/>
-            </w:r>
-            <w:r>
-              <w:rPr>
-                <w:noProof/>
-                <w:webHidden/>
-              </w:rPr>
               <w:fldChar w:fldCharType="begin"/>
-            </w:r>
-            <w:r>
-              <w:rPr>
-                <w:noProof/>
-                <w:webHidden/>
-              </w:rPr>
               <w:instrText xml:space="preserve"> PAGEREF _Toc225889251 \h </w:instrText>
-            </w:r>
-            <w:r>
-              <w:rPr>
-                <w:noProof/>
-                <w:webHidden/>
-              </w:rPr>
-            </w:r>
-            <w:r>
-              <w:rPr>
-                <w:noProof/>
-                <w:webHidden/>
-              </w:rPr>
               <w:fldChar w:fldCharType="separate"/>
-            </w:r>
-            <w:r>
-              <w:rPr>
-                <w:noProof/>
-                <w:webHidden/>
-              </w:rPr>
               <w:t>5</w:t>
-            </w:r>
-            <w:r>
-              <w:rPr>
-                <w:noProof/>
-                <w:webHidden/>
-              </w:rPr>
               <w:fldChar w:fldCharType="end"/>
             </w:r>
           </w:hyperlink>
@@ -835,46 +675,10 @@
                 <w:webHidden/>
               </w:rPr>
               <w:tab/>
-            </w:r>
-            <w:r>
-              <w:rPr>
-                <w:noProof/>
-                <w:webHidden/>
-              </w:rPr>
               <w:fldChar w:fldCharType="begin"/>
-            </w:r>
-            <w:r>
-              <w:rPr>
-                <w:noProof/>
-                <w:webHidden/>
-              </w:rPr>
               <w:instrText xml:space="preserve"> PAGEREF _Toc225889252 \h </w:instrText>
-            </w:r>
-            <w:r>
-              <w:rPr>
-                <w:noProof/>
-                <w:webHidden/>
-              </w:rPr>
-            </w:r>
-            <w:r>
-              <w:rPr>
-                <w:noProof/>
-                <w:webHidden/>
-              </w:rPr>
               <w:fldChar w:fldCharType="separate"/>
-            </w:r>
-            <w:r>
-              <w:rPr>
-                <w:noProof/>
-                <w:webHidden/>
-              </w:rPr>
               <w:t>5</w:t>
-            </w:r>
-            <w:r>
-              <w:rPr>
-                <w:noProof/>
-                <w:webHidden/>
-              </w:rPr>
               <w:fldChar w:fldCharType="end"/>
             </w:r>
           </w:hyperlink>
@@ -910,46 +714,10 @@
                 <w:webHidden/>
               </w:rPr>
               <w:tab/>
-            </w:r>
-            <w:r>
-              <w:rPr>
-                <w:noProof/>
-                <w:webHidden/>
-              </w:rPr>
               <w:fldChar w:fldCharType="begin"/>
-            </w:r>
-            <w:r>
-              <w:rPr>
-                <w:noProof/>
-                <w:webHidden/>
-              </w:rPr>
               <w:instrText xml:space="preserve"> PAGEREF _Toc225889253 \h </w:instrText>
-            </w:r>
-            <w:r>
-              <w:rPr>
-                <w:noProof/>
-                <w:webHidden/>
-              </w:rPr>
-            </w:r>
-            <w:r>
-              <w:rPr>
-                <w:noProof/>
-                <w:webHidden/>
-              </w:rPr>
               <w:fldChar w:fldCharType="separate"/>
-            </w:r>
-            <w:r>
-              <w:rPr>
-                <w:noProof/>
-                <w:webHidden/>
-              </w:rPr>
               <w:t>5</w:t>
-            </w:r>
-            <w:r>
-              <w:rPr>
-                <w:noProof/>
-                <w:webHidden/>
-              </w:rPr>
               <w:fldChar w:fldCharType="end"/>
             </w:r>
           </w:hyperlink>
@@ -985,46 +753,10 @@
                 <w:webHidden/>
               </w:rPr>
               <w:tab/>
-            </w:r>
-            <w:r>
-              <w:rPr>
-                <w:noProof/>
-                <w:webHidden/>
-              </w:rPr>
               <w:fldChar w:fldCharType="begin"/>
-            </w:r>
-            <w:r>
-              <w:rPr>
-                <w:noProof/>
-                <w:webHidden/>
-              </w:rPr>
               <w:instrText xml:space="preserve"> PAGEREF _Toc225889254 \h </w:instrText>
-            </w:r>
-            <w:r>
-              <w:rPr>
-                <w:noProof/>
-                <w:webHidden/>
-              </w:rPr>
-            </w:r>
-            <w:r>
-              <w:rPr>
-                <w:noProof/>
-                <w:webHidden/>
-              </w:rPr>
               <w:fldChar w:fldCharType="separate"/>
-            </w:r>
-            <w:r>
-              <w:rPr>
-                <w:noProof/>
-                <w:webHidden/>
-              </w:rPr>
               <w:t>6</w:t>
-            </w:r>
-            <w:r>
-              <w:rPr>
-                <w:noProof/>
-                <w:webHidden/>
-              </w:rPr>
               <w:fldChar w:fldCharType="end"/>
             </w:r>
           </w:hyperlink>
@@ -1060,46 +792,10 @@
                 <w:webHidden/>
               </w:rPr>
               <w:tab/>
-            </w:r>
-            <w:r>
-              <w:rPr>
-                <w:noProof/>
-                <w:webHidden/>
-              </w:rPr>
               <w:fldChar w:fldCharType="begin"/>
-            </w:r>
-            <w:r>
-              <w:rPr>
-                <w:noProof/>
-                <w:webHidden/>
-              </w:rPr>
               <w:instrText xml:space="preserve"> PAGEREF _Toc225889255 \h </w:instrText>
-            </w:r>
-            <w:r>
-              <w:rPr>
-                <w:noProof/>
-                <w:webHidden/>
-              </w:rPr>
-            </w:r>
-            <w:r>
-              <w:rPr>
-                <w:noProof/>
-                <w:webHidden/>
-              </w:rPr>
               <w:fldChar w:fldCharType="separate"/>
-            </w:r>
-            <w:r>
-              <w:rPr>
-                <w:noProof/>
-                <w:webHidden/>
-              </w:rPr>
               <w:t>7</w:t>
-            </w:r>
-            <w:r>
-              <w:rPr>
-                <w:noProof/>
-                <w:webHidden/>
-              </w:rPr>
               <w:fldChar w:fldCharType="end"/>
             </w:r>
           </w:hyperlink>
@@ -1135,46 +831,10 @@
                 <w:webHidden/>
               </w:rPr>
               <w:tab/>
-            </w:r>
-            <w:r>
-              <w:rPr>
-                <w:noProof/>
-                <w:webHidden/>
-              </w:rPr>
               <w:fldChar w:fldCharType="begin"/>
-            </w:r>
-            <w:r>
-              <w:rPr>
-                <w:noProof/>
-                <w:webHidden/>
-              </w:rPr>
               <w:instrText xml:space="preserve"> PAGEREF _Toc225889256 \h </w:instrText>
-            </w:r>
-            <w:r>
-              <w:rPr>
-                <w:noProof/>
-                <w:webHidden/>
-              </w:rPr>
-            </w:r>
-            <w:r>
-              <w:rPr>
-                <w:noProof/>
-                <w:webHidden/>
-              </w:rPr>
               <w:fldChar w:fldCharType="separate"/>
-            </w:r>
-            <w:r>
-              <w:rPr>
-                <w:noProof/>
-                <w:webHidden/>
-              </w:rPr>
               <w:t>9</w:t>
-            </w:r>
-            <w:r>
-              <w:rPr>
-                <w:noProof/>
-                <w:webHidden/>
-              </w:rPr>
               <w:fldChar w:fldCharType="end"/>
             </w:r>
           </w:hyperlink>
@@ -1210,46 +870,10 @@
                 <w:webHidden/>
               </w:rPr>
               <w:tab/>
-            </w:r>
-            <w:r>
-              <w:rPr>
-                <w:noProof/>
-                <w:webHidden/>
-              </w:rPr>
               <w:fldChar w:fldCharType="begin"/>
-            </w:r>
-            <w:r>
-              <w:rPr>
-                <w:noProof/>
-                <w:webHidden/>
-              </w:rPr>
               <w:instrText xml:space="preserve"> PAGEREF _Toc225889257 \h </w:instrText>
-            </w:r>
-            <w:r>
-              <w:rPr>
-                <w:noProof/>
-                <w:webHidden/>
-              </w:rPr>
-            </w:r>
-            <w:r>
-              <w:rPr>
-                <w:noProof/>
-                <w:webHidden/>
-              </w:rPr>
               <w:fldChar w:fldCharType="separate"/>
-            </w:r>
-            <w:r>
-              <w:rPr>
-                <w:noProof/>
-                <w:webHidden/>
-              </w:rPr>
               <w:t>9</w:t>
-            </w:r>
-            <w:r>
-              <w:rPr>
-                <w:noProof/>
-                <w:webHidden/>
-              </w:rPr>
               <w:fldChar w:fldCharType="end"/>
             </w:r>
           </w:hyperlink>
@@ -1283,46 +907,10 @@
                 <w:webHidden/>
               </w:rPr>
               <w:tab/>
-            </w:r>
-            <w:r>
-              <w:rPr>
-                <w:noProof/>
-                <w:webHidden/>
-              </w:rPr>
               <w:fldChar w:fldCharType="begin"/>
-            </w:r>
-            <w:r>
-              <w:rPr>
-                <w:noProof/>
-                <w:webHidden/>
-              </w:rPr>
               <w:instrText xml:space="preserve"> PAGEREF _Toc225889258 \h </w:instrText>
-            </w:r>
-            <w:r>
-              <w:rPr>
-                <w:noProof/>
-                <w:webHidden/>
-              </w:rPr>
-            </w:r>
-            <w:r>
-              <w:rPr>
-                <w:noProof/>
-                <w:webHidden/>
-              </w:rPr>
               <w:fldChar w:fldCharType="separate"/>
-            </w:r>
-            <w:r>
-              <w:rPr>
-                <w:noProof/>
-                <w:webHidden/>
-              </w:rPr>
               <w:t>9</w:t>
-            </w:r>
-            <w:r>
-              <w:rPr>
-                <w:noProof/>
-                <w:webHidden/>
-              </w:rPr>
               <w:fldChar w:fldCharType="end"/>
             </w:r>
           </w:hyperlink>
@@ -1358,46 +946,10 @@
                 <w:webHidden/>
               </w:rPr>
               <w:tab/>
-            </w:r>
-            <w:r>
-              <w:rPr>
-                <w:noProof/>
-                <w:webHidden/>
-              </w:rPr>
               <w:fldChar w:fldCharType="begin"/>
-            </w:r>
-            <w:r>
-              <w:rPr>
-                <w:noProof/>
-                <w:webHidden/>
-              </w:rPr>
               <w:instrText xml:space="preserve"> PAGEREF _Toc225889259 \h </w:instrText>
-            </w:r>
-            <w:r>
-              <w:rPr>
-                <w:noProof/>
-                <w:webHidden/>
-              </w:rPr>
-            </w:r>
-            <w:r>
-              <w:rPr>
-                <w:noProof/>
-                <w:webHidden/>
-              </w:rPr>
               <w:fldChar w:fldCharType="separate"/>
-            </w:r>
-            <w:r>
-              <w:rPr>
-                <w:noProof/>
-                <w:webHidden/>
-              </w:rPr>
               <w:t>10</w:t>
-            </w:r>
-            <w:r>
-              <w:rPr>
-                <w:noProof/>
-                <w:webHidden/>
-              </w:rPr>
               <w:fldChar w:fldCharType="end"/>
             </w:r>
           </w:hyperlink>
@@ -1433,46 +985,10 @@
                 <w:webHidden/>
               </w:rPr>
               <w:tab/>
-            </w:r>
-            <w:r>
-              <w:rPr>
-                <w:noProof/>
-                <w:webHidden/>
-              </w:rPr>
               <w:fldChar w:fldCharType="begin"/>
-            </w:r>
-            <w:r>
-              <w:rPr>
-                <w:noProof/>
-                <w:webHidden/>
-              </w:rPr>
               <w:instrText xml:space="preserve"> PAGEREF _Toc225889260 \h </w:instrText>
-            </w:r>
-            <w:r>
-              <w:rPr>
-                <w:noProof/>
-                <w:webHidden/>
-              </w:rPr>
-            </w:r>
-            <w:r>
-              <w:rPr>
-                <w:noProof/>
-                <w:webHidden/>
-              </w:rPr>
               <w:fldChar w:fldCharType="separate"/>
-            </w:r>
-            <w:r>
-              <w:rPr>
-                <w:noProof/>
-                <w:webHidden/>
-              </w:rPr>
               <w:t>10</w:t>
-            </w:r>
-            <w:r>
-              <w:rPr>
-                <w:noProof/>
-                <w:webHidden/>
-              </w:rPr>
               <w:fldChar w:fldCharType="end"/>
             </w:r>
           </w:hyperlink>
@@ -1508,46 +1024,10 @@
                 <w:webHidden/>
               </w:rPr>
               <w:tab/>
-            </w:r>
-            <w:r>
-              <w:rPr>
-                <w:noProof/>
-                <w:webHidden/>
-              </w:rPr>
               <w:fldChar w:fldCharType="begin"/>
-            </w:r>
-            <w:r>
-              <w:rPr>
-                <w:noProof/>
-                <w:webHidden/>
-              </w:rPr>
               <w:instrText xml:space="preserve"> PAGEREF _Toc225889261 \h </w:instrText>
-            </w:r>
-            <w:r>
-              <w:rPr>
-                <w:noProof/>
-                <w:webHidden/>
-              </w:rPr>
-            </w:r>
-            <w:r>
-              <w:rPr>
-                <w:noProof/>
-                <w:webHidden/>
-              </w:rPr>
               <w:fldChar w:fldCharType="separate"/>
-            </w:r>
-            <w:r>
-              <w:rPr>
-                <w:noProof/>
-                <w:webHidden/>
-              </w:rPr>
               <w:t>11</w:t>
-            </w:r>
-            <w:r>
-              <w:rPr>
-                <w:noProof/>
-                <w:webHidden/>
-              </w:rPr>
               <w:fldChar w:fldCharType="end"/>
             </w:r>
           </w:hyperlink>
@@ -1583,46 +1063,10 @@
                 <w:webHidden/>
               </w:rPr>
               <w:tab/>
-            </w:r>
-            <w:r>
-              <w:rPr>
-                <w:noProof/>
-                <w:webHidden/>
-              </w:rPr>
               <w:fldChar w:fldCharType="begin"/>
-            </w:r>
-            <w:r>
-              <w:rPr>
-                <w:noProof/>
-                <w:webHidden/>
-              </w:rPr>
               <w:instrText xml:space="preserve"> PAGEREF _Toc225889262 \h </w:instrText>
-            </w:r>
-            <w:r>
-              <w:rPr>
-                <w:noProof/>
-                <w:webHidden/>
-              </w:rPr>
-            </w:r>
-            <w:r>
-              <w:rPr>
-                <w:noProof/>
-                <w:webHidden/>
-              </w:rPr>
               <w:fldChar w:fldCharType="separate"/>
-            </w:r>
-            <w:r>
-              <w:rPr>
-                <w:noProof/>
-                <w:webHidden/>
-              </w:rPr>
               <w:t>12</w:t>
-            </w:r>
-            <w:r>
-              <w:rPr>
-                <w:noProof/>
-                <w:webHidden/>
-              </w:rPr>
               <w:fldChar w:fldCharType="end"/>
             </w:r>
           </w:hyperlink>
@@ -1658,46 +1102,10 @@
                 <w:webHidden/>
               </w:rPr>
               <w:tab/>
-            </w:r>
-            <w:r>
-              <w:rPr>
-                <w:noProof/>
-                <w:webHidden/>
-              </w:rPr>
               <w:fldChar w:fldCharType="begin"/>
-            </w:r>
-            <w:r>
-              <w:rPr>
-                <w:noProof/>
-                <w:webHidden/>
-              </w:rPr>
               <w:instrText xml:space="preserve"> PAGEREF _Toc225889263 \h </w:instrText>
-            </w:r>
-            <w:r>
-              <w:rPr>
-                <w:noProof/>
-                <w:webHidden/>
-              </w:rPr>
-            </w:r>
-            <w:r>
-              <w:rPr>
-                <w:noProof/>
-                <w:webHidden/>
-              </w:rPr>
               <w:fldChar w:fldCharType="separate"/>
-            </w:r>
-            <w:r>
-              <w:rPr>
-                <w:noProof/>
-                <w:webHidden/>
-              </w:rPr>
               <w:t>12</w:t>
-            </w:r>
-            <w:r>
-              <w:rPr>
-                <w:noProof/>
-                <w:webHidden/>
-              </w:rPr>
               <w:fldChar w:fldCharType="end"/>
             </w:r>
           </w:hyperlink>
@@ -1731,46 +1139,10 @@
                 <w:webHidden/>
               </w:rPr>
               <w:tab/>
-            </w:r>
-            <w:r>
-              <w:rPr>
-                <w:noProof/>
-                <w:webHidden/>
-              </w:rPr>
               <w:fldChar w:fldCharType="begin"/>
-            </w:r>
-            <w:r>
-              <w:rPr>
-                <w:noProof/>
-                <w:webHidden/>
-              </w:rPr>
               <w:instrText xml:space="preserve"> PAGEREF _Toc225889264 \h </w:instrText>
-            </w:r>
-            <w:r>
-              <w:rPr>
-                <w:noProof/>
-                <w:webHidden/>
-              </w:rPr>
-            </w:r>
-            <w:r>
-              <w:rPr>
-                <w:noProof/>
-                <w:webHidden/>
-              </w:rPr>
               <w:fldChar w:fldCharType="separate"/>
-            </w:r>
-            <w:r>
-              <w:rPr>
-                <w:noProof/>
-                <w:webHidden/>
-              </w:rPr>
               <w:t>12</w:t>
-            </w:r>
-            <w:r>
-              <w:rPr>
-                <w:noProof/>
-                <w:webHidden/>
-              </w:rPr>
               <w:fldChar w:fldCharType="end"/>
             </w:r>
           </w:hyperlink>
@@ -1804,46 +1176,10 @@
                 <w:webHidden/>
               </w:rPr>
               <w:tab/>
-            </w:r>
-            <w:r>
-              <w:rPr>
-                <w:noProof/>
-                <w:webHidden/>
-              </w:rPr>
               <w:fldChar w:fldCharType="begin"/>
-            </w:r>
-            <w:r>
-              <w:rPr>
-                <w:noProof/>
-                <w:webHidden/>
-              </w:rPr>
               <w:instrText xml:space="preserve"> PAGEREF _Toc225889265 \h </w:instrText>
-            </w:r>
-            <w:r>
-              <w:rPr>
-                <w:noProof/>
-                <w:webHidden/>
-              </w:rPr>
-            </w:r>
-            <w:r>
-              <w:rPr>
-                <w:noProof/>
-                <w:webHidden/>
-              </w:rPr>
               <w:fldChar w:fldCharType="separate"/>
-            </w:r>
-            <w:r>
-              <w:rPr>
-                <w:noProof/>
-                <w:webHidden/>
-              </w:rPr>
               <w:t>13</w:t>
-            </w:r>
-            <w:r>
-              <w:rPr>
-                <w:noProof/>
-                <w:webHidden/>
-              </w:rPr>
               <w:fldChar w:fldCharType="end"/>
             </w:r>
           </w:hyperlink>
@@ -1877,46 +1213,10 @@
                 <w:webHidden/>
               </w:rPr>
               <w:tab/>
-            </w:r>
-            <w:r>
-              <w:rPr>
-                <w:noProof/>
-                <w:webHidden/>
-              </w:rPr>
               <w:fldChar w:fldCharType="begin"/>
-            </w:r>
-            <w:r>
-              <w:rPr>
-                <w:noProof/>
-                <w:webHidden/>
-              </w:rPr>
               <w:instrText xml:space="preserve"> PAGEREF _Toc225889266 \h </w:instrText>
-            </w:r>
-            <w:r>
-              <w:rPr>
-                <w:noProof/>
-                <w:webHidden/>
-              </w:rPr>
-            </w:r>
-            <w:r>
-              <w:rPr>
-                <w:noProof/>
-                <w:webHidden/>
-              </w:rPr>
               <w:fldChar w:fldCharType="separate"/>
-            </w:r>
-            <w:r>
-              <w:rPr>
-                <w:noProof/>
-                <w:webHidden/>
-              </w:rPr>
               <w:t>13</w:t>
-            </w:r>
-            <w:r>
-              <w:rPr>
-                <w:noProof/>
-                <w:webHidden/>
-              </w:rPr>
               <w:fldChar w:fldCharType="end"/>
             </w:r>
           </w:hyperlink>
@@ -1950,46 +1250,10 @@
                 <w:webHidden/>
               </w:rPr>
               <w:tab/>
-            </w:r>
-            <w:r>
-              <w:rPr>
-                <w:noProof/>
-                <w:webHidden/>
-              </w:rPr>
               <w:fldChar w:fldCharType="begin"/>
-            </w:r>
-            <w:r>
-              <w:rPr>
-                <w:noProof/>
-                <w:webHidden/>
-              </w:rPr>
               <w:instrText xml:space="preserve"> PAGEREF _Toc225889267 \h </w:instrText>
-            </w:r>
-            <w:r>
-              <w:rPr>
-                <w:noProof/>
-                <w:webHidden/>
-              </w:rPr>
-            </w:r>
-            <w:r>
-              <w:rPr>
-                <w:noProof/>
-                <w:webHidden/>
-              </w:rPr>
               <w:fldChar w:fldCharType="separate"/>
-            </w:r>
-            <w:r>
-              <w:rPr>
-                <w:noProof/>
-                <w:webHidden/>
-              </w:rPr>
               <w:t>14</w:t>
-            </w:r>
-            <w:r>
-              <w:rPr>
-                <w:noProof/>
-                <w:webHidden/>
-              </w:rPr>
               <w:fldChar w:fldCharType="end"/>
             </w:r>
           </w:hyperlink>
@@ -2023,46 +1287,10 @@
                 <w:webHidden/>
               </w:rPr>
               <w:tab/>
-            </w:r>
-            <w:r>
-              <w:rPr>
-                <w:noProof/>
-                <w:webHidden/>
-              </w:rPr>
               <w:fldChar w:fldCharType="begin"/>
-            </w:r>
-            <w:r>
-              <w:rPr>
-                <w:noProof/>
-                <w:webHidden/>
-              </w:rPr>
               <w:instrText xml:space="preserve"> PAGEREF _Toc225889268 \h </w:instrText>
-            </w:r>
-            <w:r>
-              <w:rPr>
-                <w:noProof/>
-                <w:webHidden/>
-              </w:rPr>
-            </w:r>
-            <w:r>
-              <w:rPr>
-                <w:noProof/>
-                <w:webHidden/>
-              </w:rPr>
               <w:fldChar w:fldCharType="separate"/>
-            </w:r>
-            <w:r>
-              <w:rPr>
-                <w:noProof/>
-                <w:webHidden/>
-              </w:rPr>
               <w:t>14</w:t>
-            </w:r>
-            <w:r>
-              <w:rPr>
-                <w:noProof/>
-                <w:webHidden/>
-              </w:rPr>
               <w:fldChar w:fldCharType="end"/>
             </w:r>
           </w:hyperlink>
@@ -2096,46 +1324,10 @@
                 <w:webHidden/>
               </w:rPr>
               <w:tab/>
-            </w:r>
-            <w:r>
-              <w:rPr>
-                <w:noProof/>
-                <w:webHidden/>
-              </w:rPr>
               <w:fldChar w:fldCharType="begin"/>
-            </w:r>
-            <w:r>
-              <w:rPr>
-                <w:noProof/>
-                <w:webHidden/>
-              </w:rPr>
               <w:instrText xml:space="preserve"> PAGEREF _Toc225889269 \h </w:instrText>
-            </w:r>
-            <w:r>
-              <w:rPr>
-                <w:noProof/>
-                <w:webHidden/>
-              </w:rPr>
-            </w:r>
-            <w:r>
-              <w:rPr>
-                <w:noProof/>
-                <w:webHidden/>
-              </w:rPr>
               <w:fldChar w:fldCharType="separate"/>
-            </w:r>
-            <w:r>
-              <w:rPr>
-                <w:noProof/>
-                <w:webHidden/>
-              </w:rPr>
               <w:t>15</w:t>
-            </w:r>
-            <w:r>
-              <w:rPr>
-                <w:noProof/>
-                <w:webHidden/>
-              </w:rPr>
               <w:fldChar w:fldCharType="end"/>
             </w:r>
           </w:hyperlink>
@@ -2169,46 +1361,10 @@
                 <w:webHidden/>
               </w:rPr>
               <w:tab/>
-            </w:r>
-            <w:r>
-              <w:rPr>
-                <w:noProof/>
-                <w:webHidden/>
-              </w:rPr>
               <w:fldChar w:fldCharType="begin"/>
-            </w:r>
-            <w:r>
-              <w:rPr>
-                <w:noProof/>
-                <w:webHidden/>
-              </w:rPr>
               <w:instrText xml:space="preserve"> PAGEREF _Toc225889270 \h </w:instrText>
-            </w:r>
-            <w:r>
-              <w:rPr>
-                <w:noProof/>
-                <w:webHidden/>
-              </w:rPr>
-            </w:r>
-            <w:r>
-              <w:rPr>
-                <w:noProof/>
-                <w:webHidden/>
-              </w:rPr>
               <w:fldChar w:fldCharType="separate"/>
-            </w:r>
-            <w:r>
-              <w:rPr>
-                <w:noProof/>
-                <w:webHidden/>
-              </w:rPr>
               <w:t>15</w:t>
-            </w:r>
-            <w:r>
-              <w:rPr>
-                <w:noProof/>
-                <w:webHidden/>
-              </w:rPr>
               <w:fldChar w:fldCharType="end"/>
             </w:r>
           </w:hyperlink>
@@ -2244,46 +1400,10 @@
                 <w:webHidden/>
               </w:rPr>
               <w:tab/>
-            </w:r>
-            <w:r>
-              <w:rPr>
-                <w:noProof/>
-                <w:webHidden/>
-              </w:rPr>
               <w:fldChar w:fldCharType="begin"/>
-            </w:r>
-            <w:r>
-              <w:rPr>
-                <w:noProof/>
-                <w:webHidden/>
-              </w:rPr>
               <w:instrText xml:space="preserve"> PAGEREF _Toc225889271 \h </w:instrText>
-            </w:r>
-            <w:r>
-              <w:rPr>
-                <w:noProof/>
-                <w:webHidden/>
-              </w:rPr>
-            </w:r>
-            <w:r>
-              <w:rPr>
-                <w:noProof/>
-                <w:webHidden/>
-              </w:rPr>
               <w:fldChar w:fldCharType="separate"/>
-            </w:r>
-            <w:r>
-              <w:rPr>
-                <w:noProof/>
-                <w:webHidden/>
-              </w:rPr>
               <w:t>16</w:t>
-            </w:r>
-            <w:r>
-              <w:rPr>
-                <w:noProof/>
-                <w:webHidden/>
-              </w:rPr>
               <w:fldChar w:fldCharType="end"/>
             </w:r>
           </w:hyperlink>
@@ -2319,46 +1439,10 @@
                 <w:webHidden/>
               </w:rPr>
               <w:tab/>
-            </w:r>
-            <w:r>
-              <w:rPr>
-                <w:noProof/>
-                <w:webHidden/>
-              </w:rPr>
               <w:fldChar w:fldCharType="begin"/>
-            </w:r>
-            <w:r>
-              <w:rPr>
-                <w:noProof/>
-                <w:webHidden/>
-              </w:rPr>
               <w:instrText xml:space="preserve"> PAGEREF _Toc225889272 \h </w:instrText>
-            </w:r>
-            <w:r>
-              <w:rPr>
-                <w:noProof/>
-                <w:webHidden/>
-              </w:rPr>
-            </w:r>
-            <w:r>
-              <w:rPr>
-                <w:noProof/>
-                <w:webHidden/>
-              </w:rPr>
               <w:fldChar w:fldCharType="separate"/>
-            </w:r>
-            <w:r>
-              <w:rPr>
-                <w:noProof/>
-                <w:webHidden/>
-              </w:rPr>
               <w:t>16</w:t>
-            </w:r>
-            <w:r>
-              <w:rPr>
-                <w:noProof/>
-                <w:webHidden/>
-              </w:rPr>
               <w:fldChar w:fldCharType="end"/>
             </w:r>
           </w:hyperlink>
@@ -4446,7 +3530,7 @@
         </w:numPr>
       </w:pPr>
       <w:r>
-        <w:t>Clonar el repositorio: git clone https://github.com/kazc93/proyecto-hipstagram</w:t>
+        <w:t>Clonar el repositorio: git clone https://github.com/kazc93/Hipstagram</w:t>
       </w:r>
     </w:p>
     <w:p>
@@ -4586,7 +3670,7 @@
         </w:numPr>
       </w:pPr>
       <w:r>
-        <w:t>Grupo de seguridad EC2: puertos 3000 (API Gateway) y 4200 (frontend) abiertos hacia Internet; puertos 3001-3004 solo internos entre contenedores.</w:t>
+        <w:t>Grupo de seguridad EC2: puerto 3000 (backend) abierto hacia Internet. El frontend se despliega en AWS Amplify (acceso HTTPS gestionado por Amplify). La variable CORS_ORIGIN del backend debe incluir la URL de Amplify.</w:t>
       </w:r>
     </w:p>
     <w:p>
@@ -4678,11 +3762,6 @@
           <w:rFonts w:cs="Times New Roman"/>
         </w:rPr>
         <w:t xml:space="preserve">Consistencia e Integridad Referencial: Las FK desde posts hacia votos y comentarios tienen restricción RESTRICT. Si un usuario (rol USER) intenta eliminar un post con </w:t>
-      </w:r>
-      <w:r>
-        <w:rPr>
-          <w:rFonts w:cs="Times New Roman"/>
-        </w:rPr>
         <w:lastRenderedPageBreak/>
         <w:t>dependencias, el backend retorna HTTP 409 con el detalle de votos y comentarios existentes. Un administrador puede forzar la eliminación en cascade desde el endpoint DELETE /api/admin/posts/:id. Además, la inserción de hashtags al crear un post usa SAVEPOINT de PostgreSQL: si falla algún hashtag, solo se revierte esa parte sin cancelar la publicación completa.</w:t>
       </w:r>
@@ -10252,6 +9331,110 @@
           <w:p>
             <w:r>
               <w:t>Nombre del hashtag bloqueado (normalizado, sin #).</w:t>
+            </w:r>
+          </w:p>
+        </w:tc>
+      </w:tr>
+      <w:tr>
+        <w:tc>
+          <w:tcPr>
+            <w:tcW w:w="1722" w:type="dxa"/>
+          </w:tcPr>
+          <w:p>
+            <w:r>
+              <w:t>agregado_por</w:t>
+            </w:r>
+          </w:p>
+        </w:tc>
+        <w:tc>
+          <w:tcPr>
+            <w:tcW w:w="1879" w:type="dxa"/>
+          </w:tcPr>
+          <w:p>
+            <w:r>
+              <w:t>INT</w:t>
+            </w:r>
+          </w:p>
+        </w:tc>
+        <w:tc>
+          <w:tcPr>
+            <w:tcW w:w="1218" w:type="dxa"/>
+          </w:tcPr>
+          <w:p>
+            <w:r>
+              <w:t>Nulo</w:t>
+            </w:r>
+          </w:p>
+        </w:tc>
+        <w:tc>
+          <w:tcPr>
+            <w:tcW w:w="1134" w:type="dxa"/>
+          </w:tcPr>
+          <w:p>
+            <w:r>
+              <w:t>FK</w:t>
+            </w:r>
+          </w:p>
+        </w:tc>
+        <w:tc>
+          <w:tcPr>
+            <w:tcW w:w="3119" w:type="dxa"/>
+          </w:tcPr>
+          <w:p>
+            <w:r>
+              <w:t>Referencia al administrador que agrego el hashtag (Tabla Usuarios).</w:t>
+            </w:r>
+          </w:p>
+        </w:tc>
+      </w:tr>
+      <w:tr>
+        <w:tc>
+          <w:tcPr>
+            <w:tcW w:w="1722" w:type="dxa"/>
+          </w:tcPr>
+          <w:p>
+            <w:r>
+              <w:t>fecha_agregado</w:t>
+            </w:r>
+          </w:p>
+        </w:tc>
+        <w:tc>
+          <w:tcPr>
+            <w:tcW w:w="1879" w:type="dxa"/>
+          </w:tcPr>
+          <w:p>
+            <w:r>
+              <w:t>TIMESTAMP</w:t>
+            </w:r>
+          </w:p>
+        </w:tc>
+        <w:tc>
+          <w:tcPr>
+            <w:tcW w:w="1218" w:type="dxa"/>
+          </w:tcPr>
+          <w:p>
+            <w:r>
+              <w:t>No Nulo</w:t>
+            </w:r>
+          </w:p>
+        </w:tc>
+        <w:tc>
+          <w:tcPr>
+            <w:tcW w:w="1134" w:type="dxa"/>
+          </w:tcPr>
+          <w:p>
+            <w:r>
+              <w:t xml:space="preserve"> </w:t>
+            </w:r>
+          </w:p>
+        </w:tc>
+        <w:tc>
+          <w:tcPr>
+            <w:tcW w:w="3119" w:type="dxa"/>
+          </w:tcPr>
+          <w:p>
+            <w:r>
+              <w:t>Fecha y hora en que se registro el hashtag prohibido. Por defecto: CURRENT_TIMESTAMP.</w:t>
             </w:r>
           </w:p>
         </w:tc>

</xml_diff>

<commit_message>
trabajo echo: corregir la documentacion en microservicios
</commit_message>
<xml_diff>
--- a/Documentacion/Arquitectura-P3.docx
+++ b/Documentacion/Arquitectura-P3.docx
@@ -1714,7 +1714,7 @@
         <w:rPr>
           <w:rFonts w:cs="Times New Roman"/>
         </w:rPr>
-        <w:t>Auth &amp; User Service: Microservicio responsable de la gestión de identidades, registro de usuarios, validación de credenciales, emisión de tokens JWT y administración de perfiles.</w:t>
+        <w:t>Auth Service (puerto 3001): Microservicio responsable de la gestión de identidades, registro de usuarios, validación de credenciales y emisión de tokens JWT.</w:t>
       </w:r>
     </w:p>
     <w:p>
@@ -1732,7 +1732,7 @@
         <w:rPr>
           <w:rFonts w:cs="Times New Roman"/>
         </w:rPr>
-        <w:t>Post Service (SERVICE=posts, puerto 3002): Gestiona publicaciones, votos (like/dislike, UNIQUE por usuario+post) y comentarios paginados. Almacena imágenes en AWS S3 vía multer-s3 y usa SAVEPOINT para proteger la inserción de hashtags.</w:t>
+        <w:t xml:space="preserve">Post Service (puerto 3002): Gestiona publicaciones, votos (like/dislike con toggle, UNIQUE por usuario+post) y comentarios paginados. Almacena imágenes en AWS S3 vía multer-s3 y usa transacciones con SAVEPOINT para proteger la inserción de hashtags.</w:t>
       </w:r>
     </w:p>
     <w:p>
@@ -1750,7 +1750,25 @@
         <w:rPr>
           <w:rFonts w:cs="Times New Roman"/>
         </w:rPr>
-        <w:t>Search Service: Microservicio de descubrimiento que indexa descripciones y hashtags para resolver consultas de texto libre de manera eficiente.</w:t>
+        <w:t>Search Service (puerto 3003): Microservicio de descubrimiento que indexa descripciones y hashtags para resolver consultas de texto libre y exploración por popularidad.</w:t>
+      </w:r>
+    </w:p>
+    <w:p>
+      <w:pPr>
+        <w:pStyle w:val="Prrafodelista"/>
+        <w:numPr>
+          <w:ilvl w:val="0"/>
+          <w:numId w:val="1"/>
+        </w:numPr>
+        <w:rPr>
+          <w:rFonts w:cs="Times New Roman"/>
+        </w:rPr>
+      </w:pPr>
+      <w:r>
+        <w:rPr>
+          <w:rFonts w:cs="Times New Roman"/>
+        </w:rPr>
+        <w:t xml:space="preserve">Admin Service (puerto 3004): Microservicio de administración y moderación. Gestiona usuarios, modera publicaciones, administra la lista de hashtags prohibidos y expone el registro de auditoría (DoublyLinkedList en memoria con respaldo en PostgreSQL).</w:t>
       </w:r>
     </w:p>
     <w:p>

</xml_diff>